<commit_message>
otro cambio macho tiiiiiiio
a ver si este aparece
</commit_message>
<xml_diff>
--- a/primercommit_dev.docx
+++ b/primercommit_dev.docx
@@ -12,7 +12,17 @@
       </w:r>
       <w:proofErr w:type="spellEnd"/>
       <w:r>
-        <w:t xml:space="preserve"> etpo</w:t>
+        <w:t xml:space="preserve"> </w:t>
+      </w:r>
+      <w:proofErr w:type="spellStart"/>
+      <w:r>
+        <w:t>etpo</w:t>
+      </w:r>
+      <w:proofErr w:type="spellEnd"/>
+    </w:p>
+    <w:p>
+      <w:r>
+        <w:t>cambianmoososososvujhsdaoucvrwue</w:t>
       </w:r>
       <w:bookmarkStart w:id="0" w:name="_GoBack"/>
       <w:bookmarkEnd w:id="0"/>

</xml_diff>